<commit_message>
Update live deployment URL to https://dealwise-ai.vercel.app across README, reports, presentations, and documents
</commit_message>
<xml_diff>
--- a/DEALWISE_AI_PROJECT_REPORT.docx
+++ b/DEALWISE_AI_PROJECT_REPORT.docx
@@ -33,6 +33,10 @@
           <w:b/>
         </w:rPr>
         <w:t>Author: Panchaksharayya</w:t>
+        <w:br/>
+      </w:r>
+      <w:r>
+        <w:t>Live Deployed Application: https://dealwise-ai.vercel.app/</w:t>
         <w:br/>
       </w:r>
       <w:r>

</xml_diff>